<commit_message>
learning to push in branch
</commit_message>
<xml_diff>
--- a/Day00-Setup/Errors i caused.md.docx
+++ b/Day00-Setup/Errors i caused.md.docx
@@ -47,7 +47,15 @@
       </w:r>
       <w:proofErr w:type="spellEnd"/>
       <w:r>
-        <w:t xml:space="preserve"> need int i need to mention </w:t>
+        <w:t xml:space="preserve"> need int </w:t>
+      </w:r>
+      <w:proofErr w:type="spellStart"/>
+      <w:r>
+        <w:t>i</w:t>
+      </w:r>
+      <w:proofErr w:type="spellEnd"/>
+      <w:r>
+        <w:t xml:space="preserve"> need to mention </w:t>
       </w:r>
       <w:proofErr w:type="spellStart"/>
       <w:proofErr w:type="gramStart"/>
@@ -90,6 +98,39 @@
       <w:proofErr w:type="gramEnd"/>
       <w:r>
         <w:t xml:space="preserve"> use semicolon at the end of statement.</w:t>
+      </w:r>
+    </w:p>
+    <w:p>
+      <w:pPr>
+        <w:pStyle w:val="ListParagraph"/>
+        <w:ind w:left="405"/>
+      </w:pPr>
+    </w:p>
+    <w:p>
+      <w:pPr>
+        <w:pStyle w:val="ListParagraph"/>
+        <w:ind w:left="405"/>
+        <w:rPr>
+          <w:color w:val="EE0000"/>
+        </w:rPr>
+      </w:pPr>
+      <w:r>
+        <w:rPr>
+          <w:color w:val="EE0000"/>
+        </w:rPr>
+        <w:t>#</w:t>
+      </w:r>
+      <w:r>
+        <w:rPr>
+          <w:color w:val="EE0000"/>
+        </w:rPr>
+        <w:t>Writing this statement to learn how to commit changes to a local branch</w:t>
+      </w:r>
+      <w:r>
+        <w:rPr>
+          <w:color w:val="EE0000"/>
+        </w:rPr>
+        <w:t>#</w:t>
       </w:r>
     </w:p>
     <w:p>
@@ -808,6 +849,7 @@
   <w:style w:type="character" w:default="1" w:styleId="DefaultParagraphFont">
     <w:name w:val="Default Paragraph Font"/>
     <w:uiPriority w:val="1"/>
+    <w:semiHidden/>
     <w:unhideWhenUsed/>
   </w:style>
   <w:style w:type="table" w:default="1" w:styleId="TableNormal">

</xml_diff>